<commit_message>
Consistency pass: A34 numbers in README/report/Loom, neutral DOCX metadata, PDF export
Co-Authored-By: Claude Opus 5.5 <noreply@anthropic.com>
</commit_message>
<xml_diff>
--- a/reports/Freight_Rate_Report.docx
+++ b/reports/Freight_Rate_Report.docx
@@ -84,10 +84,10 @@
         <w:rPr>
           <w:b/>
         </w:rPr>
-        <w:t xml:space="preserve">Result. </w:t>
+        <w:t xml:space="preserve">Result (final model A34). </w:t>
       </w:r>
       <w:r>
-        <w:t>Time-fold MAE $40.4 (MAPE 1.85%), worst fold $64.1, vs $71.8 for ridge and $70.1 for a plain LightGBM on all features.</w:t>
+        <w:t>Time-fold MAE $40.4 (MAPE 1.85%), worst fold $64.1; city holdout $31.3, random split $28.6; vs $71.8 for ridge and $70.1 for a plain LightGBM on all features.</w:t>
       </w:r>
     </w:p>
     <w:p>
@@ -2344,7 +2344,7 @@
                 <w:b/>
                 <w:sz w:val="16"/>
               </w:rPr>
-              <w:t>FINAL: + daily quote regime + recency weights</w:t>
+              <w:t>FINAL (A34): + daily quote regime + recency</w:t>
             </w:r>
           </w:p>
         </w:tc>

</xml_diff>